<commit_message>
URL Changes Related to miChecker (minor correction) #18
</commit_message>
<xml_diff>
--- a/org.eclipse.actf.examples.michecker.doc.nl1/manual_src/miChecker_install.docx
+++ b/org.eclipse.actf.examples.michecker.doc.nl1/manual_src/miChecker_install.docx
@@ -199,7 +199,19 @@
         <w:rPr>
           <w:rFonts w:ascii="HG丸ｺﾞｼｯｸM-PRO" w:eastAsia="HG丸ｺﾞｼｯｸM-PRO" w:hAnsi="HG丸ｺﾞｼｯｸM-PRO" w:cs="Arial" w:hint="eastAsia"/>
         </w:rPr>
-        <w:t>年月</w:t>
+        <w:t>年</w:t>
+      </w:r>
+      <w:r>
+        <w:rPr>
+          <w:rFonts w:ascii="HG丸ｺﾞｼｯｸM-PRO" w:eastAsia="HG丸ｺﾞｼｯｸM-PRO" w:hAnsi="HG丸ｺﾞｼｯｸM-PRO" w:cs="Arial" w:hint="eastAsia"/>
+        </w:rPr>
+        <w:t>６</w:t>
+      </w:r>
+      <w:r>
+        <w:rPr>
+          <w:rFonts w:ascii="HG丸ｺﾞｼｯｸM-PRO" w:eastAsia="HG丸ｺﾞｼｯｸM-PRO" w:hAnsi="HG丸ｺﾞｼｯｸM-PRO" w:cs="Arial" w:hint="eastAsia"/>
+        </w:rPr>
+        <w:t>月</w:t>
       </w:r>
       <w:r>
         <w:rPr>
@@ -1669,6 +1681,12 @@
       </w:r>
       <w:r>
         <w:rPr>
+          <w:rFonts w:ascii="ＭＳ 明朝" w:hAnsi="ＭＳ 明朝"/>
+        </w:rPr>
+        <w:br/>
+      </w:r>
+      <w:r>
+        <w:rPr>
           <w:rFonts w:ascii="ＭＳ 明朝" w:hAnsi="ＭＳ 明朝" w:hint="eastAsia"/>
         </w:rPr>
         <w:t>（</w:t>
@@ -1685,21 +1703,7 @@
             <w:rStyle w:val="a4"/>
             <w:rFonts w:ascii="ＭＳ 明朝" w:hAnsi="ＭＳ 明朝"/>
           </w:rPr>
-          <w:t>https://www.soumu.go.jp/info-accessibility-portal/webaccessibility/m</w:t>
-        </w:r>
-        <w:r>
-          <w:rPr>
-            <w:rStyle w:val="a4"/>
-            <w:rFonts w:ascii="ＭＳ 明朝" w:hAnsi="ＭＳ 明朝"/>
-          </w:rPr>
-          <w:t>i</w:t>
-        </w:r>
-        <w:r>
-          <w:rPr>
-            <w:rStyle w:val="a4"/>
-            <w:rFonts w:ascii="ＭＳ 明朝" w:hAnsi="ＭＳ 明朝"/>
-          </w:rPr>
-          <w:t>checker/</w:t>
+          <w:t>https://www.soumu.go.jp/info-accessibility-portal/webaccessibility/michecker/</w:t>
         </w:r>
       </w:hyperlink>
       <w:r>
@@ -1712,7 +1716,19 @@
         <w:rPr>
           <w:rFonts w:ascii="ＭＳ 明朝" w:hAnsi="ＭＳ 明朝" w:hint="eastAsia"/>
         </w:rPr>
-        <w:t>）に</w:t>
+        <w:t>）</w:t>
+      </w:r>
+      <w:r>
+        <w:rPr>
+          <w:rFonts w:ascii="ＭＳ 明朝" w:hAnsi="ＭＳ 明朝"/>
+        </w:rPr>
+        <w:br/>
+      </w:r>
+      <w:r>
+        <w:rPr>
+          <w:rFonts w:ascii="ＭＳ 明朝" w:hAnsi="ＭＳ 明朝" w:hint="eastAsia"/>
+        </w:rPr>
+        <w:t>に</w:t>
       </w:r>
       <w:r>
         <w:rPr>
@@ -2206,7 +2222,7 @@
           <w:noProof/>
         </w:rPr>
         <w:drawing>
-          <wp:inline distT="0" distB="0" distL="0" distR="0" wp14:anchorId="5B2FF4A5" wp14:editId="4F716A2A">
+          <wp:inline distT="0" distB="0" distL="0" distR="0" wp14:anchorId="5B2FF4A5" wp14:editId="650D19E9">
             <wp:extent cx="2849880" cy="2385060"/>
             <wp:effectExtent l="0" t="0" r="0" b="0"/>
             <wp:docPr id="3" name="図 1">
@@ -3801,7 +3817,21 @@
         <w:rPr>
           <w:rFonts w:ascii="ＭＳ 明朝" w:hAnsi="ＭＳ 明朝" w:hint="eastAsia"/>
         </w:rPr>
-        <w:t>「名前」と記載された入力欄に「cmd」と入力し</w:t>
+        <w:t>「名前」と記載された入力欄に「</w:t>
+      </w:r>
+      <w:proofErr w:type="spellStart"/>
+      <w:r>
+        <w:rPr>
+          <w:rFonts w:ascii="ＭＳ 明朝" w:hAnsi="ＭＳ 明朝" w:hint="eastAsia"/>
+        </w:rPr>
+        <w:t>cmd</w:t>
+      </w:r>
+      <w:proofErr w:type="spellEnd"/>
+      <w:r>
+        <w:rPr>
+          <w:rFonts w:ascii="ＭＳ 明朝" w:hAnsi="ＭＳ 明朝" w:hint="eastAsia"/>
+        </w:rPr>
+        <w:t>」と入力し</w:t>
       </w:r>
       <w:r>
         <w:rPr>
@@ -4476,8 +4506,13 @@
         </w:pBdr>
         <w:ind w:leftChars="337" w:left="708"/>
       </w:pPr>
-      <w:r>
-        <w:t>openjdk version "17.0.5" 2022-10-18</w:t>
+      <w:proofErr w:type="spellStart"/>
+      <w:r>
+        <w:t>openjdk</w:t>
+      </w:r>
+      <w:proofErr w:type="spellEnd"/>
+      <w:r>
+        <w:t xml:space="preserve"> version "17.0.5" 2022-10-18</w:t>
       </w:r>
     </w:p>
     <w:p>
@@ -4491,7 +4526,15 @@
         <w:ind w:leftChars="337" w:left="708"/>
       </w:pPr>
       <w:r>
-        <w:t>IBM Semeru Runtime Open Edition 17.0.5.0 (build 17.0.5+8)</w:t>
+        <w:t xml:space="preserve">IBM </w:t>
+      </w:r>
+      <w:proofErr w:type="spellStart"/>
+      <w:r>
+        <w:t>Semeru</w:t>
+      </w:r>
+      <w:proofErr w:type="spellEnd"/>
+      <w:r>
+        <w:t xml:space="preserve"> Runtime Open Edition 17.0.5.0 (build 17.0.5+8)</w:t>
       </w:r>
     </w:p>
     <w:p>
@@ -4908,12 +4951,14 @@
         </w:rPr>
         <w:t>参考として各種Java環境の入手先の例と、</w:t>
       </w:r>
+      <w:proofErr w:type="spellStart"/>
       <w:r>
         <w:rPr>
           <w:rFonts w:ascii="ＭＳ 明朝" w:hAnsi="ＭＳ 明朝"/>
         </w:rPr>
         <w:t>Adoptium</w:t>
       </w:r>
+      <w:proofErr w:type="spellEnd"/>
       <w:r>
         <w:rPr>
           <w:rFonts w:ascii="ＭＳ 明朝" w:hAnsi="ＭＳ 明朝" w:hint="eastAsia"/>
@@ -5025,12 +5070,14 @@
           <w:rFonts w:ascii="ＭＳ 明朝" w:hAnsi="ＭＳ 明朝"/>
         </w:rPr>
       </w:pPr>
+      <w:proofErr w:type="spellStart"/>
       <w:r>
         <w:rPr>
           <w:rFonts w:ascii="ＭＳ 明朝" w:hAnsi="ＭＳ 明朝" w:hint="eastAsia"/>
         </w:rPr>
         <w:t>Adoptium</w:t>
       </w:r>
+      <w:proofErr w:type="spellEnd"/>
       <w:r>
         <w:rPr>
           <w:rFonts w:ascii="ＭＳ 明朝" w:hAnsi="ＭＳ 明朝" w:hint="eastAsia"/>
@@ -5041,7 +5088,21 @@
         <w:rPr>
           <w:rFonts w:ascii="ＭＳ 明朝" w:hAnsi="ＭＳ 明朝"/>
         </w:rPr>
-        <w:t>(Eclipse Temurin)</w:t>
+        <w:t xml:space="preserve">(Eclipse </w:t>
+      </w:r>
+      <w:proofErr w:type="spellStart"/>
+      <w:r>
+        <w:rPr>
+          <w:rFonts w:ascii="ＭＳ 明朝" w:hAnsi="ＭＳ 明朝"/>
+        </w:rPr>
+        <w:t>Temurin</w:t>
+      </w:r>
+      <w:proofErr w:type="spellEnd"/>
+      <w:r>
+        <w:rPr>
+          <w:rFonts w:ascii="ＭＳ 明朝" w:hAnsi="ＭＳ 明朝"/>
+        </w:rPr>
+        <w:t>)</w:t>
       </w:r>
     </w:p>
     <w:p>
@@ -5060,21 +5121,7 @@
             <w:rStyle w:val="a4"/>
             <w:rFonts w:ascii="ＭＳ 明朝" w:hAnsi="ＭＳ 明朝"/>
           </w:rPr>
-          <w:t>https://adoptium</w:t>
-        </w:r>
-        <w:r>
-          <w:rPr>
-            <w:rStyle w:val="a4"/>
-            <w:rFonts w:ascii="ＭＳ 明朝" w:hAnsi="ＭＳ 明朝"/>
-          </w:rPr>
-          <w:t>.</w:t>
-        </w:r>
-        <w:r>
-          <w:rPr>
-            <w:rStyle w:val="a4"/>
-            <w:rFonts w:ascii="ＭＳ 明朝" w:hAnsi="ＭＳ 明朝"/>
-          </w:rPr>
-          <w:t>net/</w:t>
+          <w:t>https://adoptium.net/</w:t>
         </w:r>
       </w:hyperlink>
     </w:p>
@@ -5106,12 +5153,14 @@
         </w:rPr>
         <w:t xml:space="preserve">(IBM </w:t>
       </w:r>
+      <w:proofErr w:type="spellStart"/>
       <w:r>
         <w:rPr>
           <w:rFonts w:ascii="ＭＳ 明朝" w:hAnsi="ＭＳ 明朝"/>
         </w:rPr>
         <w:t>Semeru</w:t>
       </w:r>
+      <w:proofErr w:type="spellEnd"/>
       <w:r>
         <w:rPr>
           <w:rFonts w:ascii="ＭＳ 明朝" w:hAnsi="ＭＳ 明朝"/>
@@ -5246,6 +5295,7 @@
         </w:rPr>
       </w:pPr>
       <w:bookmarkStart w:id="23" w:name="_Hlk128397837"/>
+      <w:proofErr w:type="spellStart"/>
       <w:r>
         <w:rPr>
           <w:rFonts w:ascii="HG丸ｺﾞｼｯｸM-PRO" w:eastAsia="HG丸ｺﾞｼｯｸM-PRO" w:hAnsi="HG丸ｺﾞｼｯｸM-PRO"/>
@@ -5253,6 +5303,7 @@
         </w:rPr>
         <w:t>Adoptium</w:t>
       </w:r>
+      <w:proofErr w:type="spellEnd"/>
       <w:r>
         <w:rPr>
           <w:rFonts w:ascii="HG丸ｺﾞｼｯｸM-PRO" w:eastAsia="HG丸ｺﾞｼｯｸM-PRO" w:hAnsi="HG丸ｺﾞｼｯｸM-PRO" w:hint="eastAsia"/>
@@ -5884,7 +5935,14 @@
         <w:rPr>
           <w:rFonts w:ascii="ＭＳ 明朝" w:hAnsi="ＭＳ 明朝" w:hint="eastAsia"/>
         </w:rPr>
-        <w:t>展開されたフォルダー内に、Java実行環境が入ったフォルダー（「j</w:t>
+        <w:t>展開されたフォルダー内に、Java実行環境が入ったフォルダー（「</w:t>
+      </w:r>
+      <w:proofErr w:type="spellStart"/>
+      <w:r>
+        <w:rPr>
+          <w:rFonts w:ascii="ＭＳ 明朝" w:hAnsi="ＭＳ 明朝" w:hint="eastAsia"/>
+        </w:rPr>
+        <w:t>j</w:t>
       </w:r>
       <w:r>
         <w:rPr>
@@ -5892,18 +5950,21 @@
         </w:rPr>
         <w:t>dk</w:t>
       </w:r>
+      <w:proofErr w:type="spellEnd"/>
       <w:r>
         <w:rPr>
           <w:rFonts w:ascii="ＭＳ 明朝" w:hAnsi="ＭＳ 明朝" w:hint="eastAsia"/>
         </w:rPr>
         <w:t>」で始まり「</w:t>
       </w:r>
+      <w:proofErr w:type="spellStart"/>
       <w:r>
         <w:rPr>
           <w:rFonts w:ascii="ＭＳ 明朝" w:hAnsi="ＭＳ 明朝"/>
         </w:rPr>
         <w:t>jre</w:t>
       </w:r>
+      <w:proofErr w:type="spellEnd"/>
       <w:r>
         <w:rPr>
           <w:rFonts w:ascii="ＭＳ 明朝" w:hAnsi="ＭＳ 明朝" w:hint="eastAsia"/>
@@ -6001,7 +6062,14 @@
         <w:rPr>
           <w:rFonts w:ascii="ＭＳ 明朝" w:hAnsi="ＭＳ 明朝" w:hint="eastAsia"/>
         </w:rPr>
-        <w:t>「j</w:t>
+        <w:t>「</w:t>
+      </w:r>
+      <w:proofErr w:type="spellStart"/>
+      <w:r>
+        <w:rPr>
+          <w:rFonts w:ascii="ＭＳ 明朝" w:hAnsi="ＭＳ 明朝" w:hint="eastAsia"/>
+        </w:rPr>
+        <w:t>j</w:t>
       </w:r>
       <w:r>
         <w:rPr>
@@ -6009,18 +6077,21 @@
         </w:rPr>
         <w:t>dk</w:t>
       </w:r>
+      <w:proofErr w:type="spellEnd"/>
       <w:r>
         <w:rPr>
           <w:rFonts w:ascii="ＭＳ 明朝" w:hAnsi="ＭＳ 明朝" w:hint="eastAsia"/>
         </w:rPr>
         <w:t>」で始まり「</w:t>
       </w:r>
+      <w:proofErr w:type="spellStart"/>
       <w:r>
         <w:rPr>
           <w:rFonts w:ascii="ＭＳ 明朝" w:hAnsi="ＭＳ 明朝"/>
         </w:rPr>
         <w:t>jre</w:t>
       </w:r>
+      <w:proofErr w:type="spellEnd"/>
       <w:r>
         <w:rPr>
           <w:rFonts w:ascii="ＭＳ 明朝" w:hAnsi="ＭＳ 明朝" w:hint="eastAsia"/>
@@ -6055,7 +6126,14 @@
         <w:rPr>
           <w:rFonts w:ascii="ＭＳ 明朝" w:hAnsi="ＭＳ 明朝" w:hint="eastAsia"/>
         </w:rPr>
-        <w:t>【名前の変更(M)】を選択し、フォルダーの名前を「j</w:t>
+        <w:t>【名前の変更(M)】を選択し、フォルダーの名前を「</w:t>
+      </w:r>
+      <w:proofErr w:type="spellStart"/>
+      <w:r>
+        <w:rPr>
+          <w:rFonts w:ascii="ＭＳ 明朝" w:hAnsi="ＭＳ 明朝" w:hint="eastAsia"/>
+        </w:rPr>
+        <w:t>j</w:t>
       </w:r>
       <w:r>
         <w:rPr>
@@ -6063,11 +6141,19 @@
         </w:rPr>
         <w:t>re</w:t>
       </w:r>
-      <w:r>
-        <w:rPr>
-          <w:rFonts w:ascii="ＭＳ 明朝" w:hAnsi="ＭＳ 明朝" w:hint="eastAsia"/>
-        </w:rPr>
-        <w:t>」に変更します。次に、「j</w:t>
+      <w:proofErr w:type="spellEnd"/>
+      <w:r>
+        <w:rPr>
+          <w:rFonts w:ascii="ＭＳ 明朝" w:hAnsi="ＭＳ 明朝" w:hint="eastAsia"/>
+        </w:rPr>
+        <w:t>」に変更します。次に、「</w:t>
+      </w:r>
+      <w:proofErr w:type="spellStart"/>
+      <w:r>
+        <w:rPr>
+          <w:rFonts w:ascii="ＭＳ 明朝" w:hAnsi="ＭＳ 明朝" w:hint="eastAsia"/>
+        </w:rPr>
+        <w:t>j</w:t>
       </w:r>
       <w:r>
         <w:rPr>
@@ -6075,6 +6161,7 @@
         </w:rPr>
         <w:t>re</w:t>
       </w:r>
+      <w:proofErr w:type="spellEnd"/>
       <w:r>
         <w:rPr>
           <w:rFonts w:ascii="ＭＳ 明朝" w:hAnsi="ＭＳ 明朝" w:hint="eastAsia"/>
@@ -6260,7 +6347,14 @@
         <w:rPr>
           <w:rFonts w:ascii="ＭＳ 明朝" w:hAnsi="ＭＳ 明朝" w:hint="eastAsia"/>
         </w:rPr>
-        <w:t>のフォルダー内の古い「j</w:t>
+        <w:t>のフォルダー内の古い「</w:t>
+      </w:r>
+      <w:proofErr w:type="spellStart"/>
+      <w:r>
+        <w:rPr>
+          <w:rFonts w:ascii="ＭＳ 明朝" w:hAnsi="ＭＳ 明朝" w:hint="eastAsia"/>
+        </w:rPr>
+        <w:t>j</w:t>
       </w:r>
       <w:r>
         <w:rPr>
@@ -6268,18 +6362,21 @@
         </w:rPr>
         <w:t>re</w:t>
       </w:r>
+      <w:proofErr w:type="spellEnd"/>
       <w:r>
         <w:rPr>
           <w:rFonts w:ascii="ＭＳ 明朝" w:hAnsi="ＭＳ 明朝" w:hint="eastAsia"/>
         </w:rPr>
         <w:t>」フォルダーを削除した後、新しい「</w:t>
       </w:r>
+      <w:proofErr w:type="spellStart"/>
       <w:r>
         <w:rPr>
           <w:rFonts w:ascii="ＭＳ 明朝" w:hAnsi="ＭＳ 明朝"/>
         </w:rPr>
         <w:t>jre</w:t>
       </w:r>
+      <w:proofErr w:type="spellEnd"/>
       <w:r>
         <w:rPr>
           <w:rFonts w:ascii="ＭＳ 明朝" w:hAnsi="ＭＳ 明朝" w:hint="eastAsia"/>
@@ -6457,6 +6554,7 @@
         </w:rPr>
         <w:t>」フォルダーに「</w:t>
       </w:r>
+      <w:proofErr w:type="spellStart"/>
       <w:r>
         <w:rPr>
           <w:rFonts w:hint="eastAsia"/>
@@ -6466,6 +6564,7 @@
       <w:r>
         <w:t>re</w:t>
       </w:r>
+      <w:proofErr w:type="spellEnd"/>
       <w:r>
         <w:rPr>
           <w:rFonts w:hint="eastAsia"/>
@@ -10879,6 +10978,7 @@
   <w:style w:type="character" w:default="1" w:styleId="a0">
     <w:name w:val="Default Paragraph Font"/>
     <w:uiPriority w:val="1"/>
+    <w:semiHidden/>
     <w:unhideWhenUsed/>
   </w:style>
   <w:style w:type="table" w:default="1" w:styleId="a1">

</xml_diff>